<commit_message>
chore: restore docs/devops screenshots
</commit_message>
<xml_diff>
--- a/23127365.docx
+++ b/23127365.docx
@@ -3306,7 +3306,23 @@
         <w:t>yas-staging-appset.yaml</w:t>
       </w:r>
       <w:r>
-        <w:t xml:space="preserve">) được thiết lập cơ chế đồng bộ thủ công (Manual Sync). Khi nhà phát triển gắn tag release (ví dụ `v1.2.3`), Jenkins CI sẽ tự động build image gắn tag tương ứng. Quản trị viên chỉ cần vào giao diện ArgoCD UI, đổi `targetRevision` thành `v1.2.3` và bấm nút Sync để nâng </w:t>
+        <w:t xml:space="preserve">) được thiết lập cơ chế đồng bộ thủ công (Manual Sync). Khi nhà phát triển gắn tag release (ví dụ `v1.2.3`), Jenkins CI sẽ tự động build image gắn tag tương ứng. Quản trị viên chỉ cần vào giao diện ArgoCD UI, đổi `targetRevision` thành `v1.2.3` và bấm nút Sync </w:t>
+      </w:r>
+      <w:proofErr w:type="spellStart"/>
+      <w:r>
+        <w:t>để</w:t>
+      </w:r>
+      <w:proofErr w:type="spellEnd"/>
+      <w:r>
+        <w:t xml:space="preserve"> </w:t>
+      </w:r>
+      <w:proofErr w:type="spellStart"/>
+      <w:r>
+        <w:t>nâng</w:t>
+      </w:r>
+      <w:proofErr w:type="spellEnd"/>
+      <w:r>
+        <w:t xml:space="preserve"> </w:t>
       </w:r>
       <w:proofErr w:type="spellStart"/>
       <w:r>
@@ -5025,137 +5041,9 @@
     </w:p>
     <w:p>
       <w:pPr>
-        <w:spacing w:before="20" w:after="160"/>
-        <w:jc w:val="center"/>
-      </w:pPr>
-      <w:r>
-        <w:rPr>
-          <w:i/>
-          <w:color w:val="666666"/>
-          <w:sz w:val="18"/>
-        </w:rPr>
-        <w:t>Hình 6: Sơ đồ Topology Kiali - tổng quan kết nối Service Mesh với mTLS (biểu tượng ổ khóa)</w:t>
-      </w:r>
-    </w:p>
-    <w:p>
-      <w:pPr>
         <w:spacing w:before="120" w:after="60"/>
         <w:jc w:val="center"/>
       </w:pPr>
-      <w:r>
-        <w:rPr>
-          <w:noProof/>
-        </w:rPr>
-        <w:drawing>
-          <wp:inline distT="0" distB="0" distL="0" distR="0" wp14:anchorId="45073375" wp14:editId="404DE90B">
-            <wp:extent cx="5029200" cy="2388870"/>
-            <wp:effectExtent l="0" t="0" r="0" b="0"/>
-            <wp:docPr id="6" name="Picture 6"/>
-            <wp:cNvGraphicFramePr>
-              <a:graphicFrameLocks xmlns:a="http://schemas.openxmlformats.org/drawingml/2006/main" noChangeAspect="1"/>
-            </wp:cNvGraphicFramePr>
-            <a:graphic xmlns:a="http://schemas.openxmlformats.org/drawingml/2006/main">
-              <a:graphicData uri="http://schemas.openxmlformats.org/drawingml/2006/picture">
-                <pic:pic xmlns:pic="http://schemas.openxmlformats.org/drawingml/2006/picture">
-                  <pic:nvPicPr>
-                    <pic:cNvPr id="0" name="kiali_yas_app_topology_complete_1779195566926.png"/>
-                    <pic:cNvPicPr/>
-                  </pic:nvPicPr>
-                  <pic:blipFill>
-                    <a:blip r:embed="rId15"/>
-                    <a:stretch>
-                      <a:fillRect/>
-                    </a:stretch>
-                  </pic:blipFill>
-                  <pic:spPr>
-                    <a:xfrm>
-                      <a:off x="0" y="0"/>
-                      <a:ext cx="5029200" cy="2388870"/>
-                    </a:xfrm>
-                    <a:prstGeom prst="rect">
-                      <a:avLst/>
-                    </a:prstGeom>
-                  </pic:spPr>
-                </pic:pic>
-              </a:graphicData>
-            </a:graphic>
-          </wp:inline>
-        </w:drawing>
-      </w:r>
-    </w:p>
-    <w:p>
-      <w:pPr>
-        <w:spacing w:before="20" w:after="160"/>
-        <w:jc w:val="center"/>
-      </w:pPr>
-      <w:r>
-        <w:rPr>
-          <w:i/>
-          <w:color w:val="666666"/>
-          <w:sz w:val="18"/>
-        </w:rPr>
-        <w:t>Hình 6: Sơ đồ Topology Kiali - tổng quan kết nối Service Mesh với mTLS (biểu tượng ổ khóa)</w:t>
-      </w:r>
-    </w:p>
-    <w:p>
-      <w:pPr>
-        <w:spacing w:before="120" w:after="60"/>
-        <w:jc w:val="center"/>
-      </w:pPr>
-      <w:r>
-        <w:rPr>
-          <w:noProof/>
-        </w:rPr>
-        <w:drawing>
-          <wp:inline distT="0" distB="0" distL="0" distR="0" wp14:anchorId="07F22729" wp14:editId="6FD51367">
-            <wp:extent cx="5029200" cy="2388870"/>
-            <wp:effectExtent l="0" t="0" r="0" b="0"/>
-            <wp:docPr id="7" name="Picture 7"/>
-            <wp:cNvGraphicFramePr>
-              <a:graphicFrameLocks xmlns:a="http://schemas.openxmlformats.org/drawingml/2006/main" noChangeAspect="1"/>
-            </wp:cNvGraphicFramePr>
-            <a:graphic xmlns:a="http://schemas.openxmlformats.org/drawingml/2006/main">
-              <a:graphicData uri="http://schemas.openxmlformats.org/drawingml/2006/picture">
-                <pic:pic xmlns:pic="http://schemas.openxmlformats.org/drawingml/2006/picture">
-                  <pic:nvPicPr>
-                    <pic:cNvPr id="0" name="kiali_yas_app_topology_1779195550457.png"/>
-                    <pic:cNvPicPr/>
-                  </pic:nvPicPr>
-                  <pic:blipFill>
-                    <a:blip r:embed="rId16"/>
-                    <a:stretch>
-                      <a:fillRect/>
-                    </a:stretch>
-                  </pic:blipFill>
-                  <pic:spPr>
-                    <a:xfrm>
-                      <a:off x="0" y="0"/>
-                      <a:ext cx="5029200" cy="2388870"/>
-                    </a:xfrm>
-                    <a:prstGeom prst="rect">
-                      <a:avLst/>
-                    </a:prstGeom>
-                  </pic:spPr>
-                </pic:pic>
-              </a:graphicData>
-            </a:graphic>
-          </wp:inline>
-        </w:drawing>
-      </w:r>
-    </w:p>
-    <w:p>
-      <w:pPr>
-        <w:spacing w:before="20" w:after="160"/>
-        <w:jc w:val="center"/>
-      </w:pPr>
-      <w:r>
-        <w:rPr>
-          <w:i/>
-          <w:color w:val="666666"/>
-          <w:sz w:val="18"/>
-        </w:rPr>
-        <w:t>Hình 7: Sơ đồ Topology Kiali - chi tiết luồng giao tiếp giữa các microservices</w:t>
-      </w:r>
     </w:p>
     <w:p>
       <w:pPr>
@@ -5168,7 +5056,6 @@
           <w:color w:val="008080"/>
           <w:sz w:val="28"/>
         </w:rPr>
-        <w:lastRenderedPageBreak/>
         <w:t>3. Kịch bản kiểm thử 1: Kháng lỗi tự động (Retry Policy)</w:t>
       </w:r>
     </w:p>
@@ -5452,6 +5339,14 @@
           <w:sz w:val="18"/>
         </w:rPr>
         <w:br/>
+      </w:r>
+      <w:r>
+        <w:rPr>
+          <w:rFonts w:ascii="Consolas" w:hAnsi="Consolas"/>
+          <w:color w:val="000000"/>
+          <w:sz w:val="18"/>
+        </w:rPr>
+        <w:lastRenderedPageBreak/>
         <w:t xml:space="preserve">        - cluster.local/ns/yas-app/sa/storefront-bff</w:t>
       </w:r>
       <w:r>
@@ -5651,7 +5546,6 @@
                 <w:color w:val="000000"/>
                 <w:sz w:val="19"/>
               </w:rPr>
-              <w:lastRenderedPageBreak/>
               <w:br/>
               <w:t># Kết quả trả về từ Envoy proxy chặn đứng kết nối tức thì:</w:t>
             </w:r>
@@ -5918,6 +5812,14 @@
           <w:sz w:val="18"/>
         </w:rPr>
         <w:br/>
+      </w:r>
+      <w:r>
+        <w:rPr>
+          <w:rFonts w:ascii="Consolas" w:hAnsi="Consolas"/>
+          <w:color w:val="000000"/>
+          <w:sz w:val="18"/>
+        </w:rPr>
+        <w:lastRenderedPageBreak/>
         <w:t># Kết quả: HTTP 200 OK - Truy cập được phép</w:t>
       </w:r>
       <w:r>
@@ -6058,10 +5960,34 @@
         <w:t xml:space="preserve">Grafana: </w:t>
       </w:r>
       <w:r>
-        <w:t xml:space="preserve">Được cấu hình NodePort public tại cổng 30300 để người quản lý truy cập </w:t>
+        <w:t xml:space="preserve">Được cấu hình NodePort public tại cổng 30300 để người quản </w:t>
       </w:r>
       <w:proofErr w:type="spellStart"/>
       <w:r>
+        <w:t>lý</w:t>
+      </w:r>
+      <w:proofErr w:type="spellEnd"/>
+      <w:r>
+        <w:t xml:space="preserve"> </w:t>
+      </w:r>
+      <w:proofErr w:type="spellStart"/>
+      <w:r>
+        <w:t>truy</w:t>
+      </w:r>
+      <w:proofErr w:type="spellEnd"/>
+      <w:r>
+        <w:t xml:space="preserve"> </w:t>
+      </w:r>
+      <w:proofErr w:type="spellStart"/>
+      <w:r>
+        <w:t>cập</w:t>
+      </w:r>
+      <w:proofErr w:type="spellEnd"/>
+      <w:r>
+        <w:t xml:space="preserve"> </w:t>
+      </w:r>
+      <w:proofErr w:type="spellStart"/>
+      <w:r>
         <w:t>trực</w:t>
       </w:r>
       <w:proofErr w:type="spellEnd"/>
@@ -6083,187 +6009,6 @@
       <w:proofErr w:type="spellEnd"/>
       <w:r>
         <w:t xml:space="preserve"> xa.</w:t>
-      </w:r>
-    </w:p>
-    <w:p>
-      <w:pPr>
-        <w:spacing w:before="120" w:after="60"/>
-        <w:jc w:val="center"/>
-      </w:pPr>
-      <w:r>
-        <w:rPr>
-          <w:noProof/>
-        </w:rPr>
-        <w:drawing>
-          <wp:inline distT="0" distB="0" distL="0" distR="0" wp14:anchorId="6D108FD8" wp14:editId="2F6B515F">
-            <wp:extent cx="5303520" cy="2983230"/>
-            <wp:effectExtent l="0" t="0" r="0" b="0"/>
-            <wp:docPr id="20" name="Picture 20"/>
-            <wp:cNvGraphicFramePr>
-              <a:graphicFrameLocks xmlns:a="http://schemas.openxmlformats.org/drawingml/2006/main" noChangeAspect="1"/>
-            </wp:cNvGraphicFramePr>
-            <a:graphic xmlns:a="http://schemas.openxmlformats.org/drawingml/2006/main">
-              <a:graphicData uri="http://schemas.openxmlformats.org/drawingml/2006/picture">
-                <pic:pic xmlns:pic="http://schemas.openxmlformats.org/drawingml/2006/picture">
-                  <pic:nvPicPr>
-                    <pic:cNvPr id="0" name="yas-grafana-metrics.png"/>
-                    <pic:cNvPicPr/>
-                  </pic:nvPicPr>
-                  <pic:blipFill>
-                    <a:blip r:embed="rId17"/>
-                    <a:stretch>
-                      <a:fillRect/>
-                    </a:stretch>
-                  </pic:blipFill>
-                  <pic:spPr>
-                    <a:xfrm>
-                      <a:off x="0" y="0"/>
-                      <a:ext cx="5303520" cy="2983230"/>
-                    </a:xfrm>
-                    <a:prstGeom prst="rect">
-                      <a:avLst/>
-                    </a:prstGeom>
-                  </pic:spPr>
-                </pic:pic>
-              </a:graphicData>
-            </a:graphic>
-          </wp:inline>
-        </w:drawing>
-      </w:r>
-    </w:p>
-    <w:p>
-      <w:pPr>
-        <w:spacing w:before="20" w:after="160"/>
-        <w:jc w:val="center"/>
-      </w:pPr>
-      <w:r>
-        <w:rPr>
-          <w:i/>
-          <w:color w:val="666666"/>
-          <w:sz w:val="18"/>
-        </w:rPr>
-        <w:t>Hình 9: Giao diện Grafana Dashboard - Giám sát Metrics hệ thống</w:t>
-      </w:r>
-    </w:p>
-    <w:p>
-      <w:pPr>
-        <w:spacing w:before="120" w:after="60"/>
-        <w:jc w:val="center"/>
-      </w:pPr>
-      <w:r>
-        <w:rPr>
-          <w:noProof/>
-        </w:rPr>
-        <w:drawing>
-          <wp:inline distT="0" distB="0" distL="0" distR="0" wp14:anchorId="431D85C0" wp14:editId="5EA0E13A">
-            <wp:extent cx="5303520" cy="2983230"/>
-            <wp:effectExtent l="0" t="0" r="0" b="0"/>
-            <wp:docPr id="21" name="Picture 21"/>
-            <wp:cNvGraphicFramePr>
-              <a:graphicFrameLocks xmlns:a="http://schemas.openxmlformats.org/drawingml/2006/main" noChangeAspect="1"/>
-            </wp:cNvGraphicFramePr>
-            <a:graphic xmlns:a="http://schemas.openxmlformats.org/drawingml/2006/main">
-              <a:graphicData uri="http://schemas.openxmlformats.org/drawingml/2006/picture">
-                <pic:pic xmlns:pic="http://schemas.openxmlformats.org/drawingml/2006/picture">
-                  <pic:nvPicPr>
-                    <pic:cNvPr id="0" name="prometheus-targets.png"/>
-                    <pic:cNvPicPr/>
-                  </pic:nvPicPr>
-                  <pic:blipFill>
-                    <a:blip r:embed="rId18"/>
-                    <a:stretch>
-                      <a:fillRect/>
-                    </a:stretch>
-                  </pic:blipFill>
-                  <pic:spPr>
-                    <a:xfrm>
-                      <a:off x="0" y="0"/>
-                      <a:ext cx="5303520" cy="2983230"/>
-                    </a:xfrm>
-                    <a:prstGeom prst="rect">
-                      <a:avLst/>
-                    </a:prstGeom>
-                  </pic:spPr>
-                </pic:pic>
-              </a:graphicData>
-            </a:graphic>
-          </wp:inline>
-        </w:drawing>
-      </w:r>
-    </w:p>
-    <w:p>
-      <w:pPr>
-        <w:spacing w:before="20" w:after="160"/>
-        <w:jc w:val="center"/>
-      </w:pPr>
-      <w:r>
-        <w:rPr>
-          <w:i/>
-          <w:color w:val="666666"/>
-          <w:sz w:val="18"/>
-        </w:rPr>
-        <w:t>Hình 10: Giao diện Grafana - Distributed Tracing (Loki Logs)</w:t>
-      </w:r>
-    </w:p>
-    <w:p>
-      <w:pPr>
-        <w:spacing w:before="120" w:after="60"/>
-        <w:jc w:val="center"/>
-      </w:pPr>
-      <w:r>
-        <w:rPr>
-          <w:noProof/>
-        </w:rPr>
-        <w:lastRenderedPageBreak/>
-        <w:drawing>
-          <wp:inline distT="0" distB="0" distL="0" distR="0" wp14:anchorId="5CED5D0A" wp14:editId="191722D9">
-            <wp:extent cx="5029200" cy="4215225"/>
-            <wp:effectExtent l="0" t="0" r="0" b="0"/>
-            <wp:docPr id="22" name="Picture 22"/>
-            <wp:cNvGraphicFramePr>
-              <a:graphicFrameLocks xmlns:a="http://schemas.openxmlformats.org/drawingml/2006/main" noChangeAspect="1"/>
-            </wp:cNvGraphicFramePr>
-            <a:graphic xmlns:a="http://schemas.openxmlformats.org/drawingml/2006/main">
-              <a:graphicData uri="http://schemas.openxmlformats.org/drawingml/2006/picture">
-                <pic:pic xmlns:pic="http://schemas.openxmlformats.org/drawingml/2006/picture">
-                  <pic:nvPicPr>
-                    <pic:cNvPr id="0" name="image.png"/>
-                    <pic:cNvPicPr/>
-                  </pic:nvPicPr>
-                  <pic:blipFill>
-                    <a:blip r:embed="rId19"/>
-                    <a:stretch>
-                      <a:fillRect/>
-                    </a:stretch>
-                  </pic:blipFill>
-                  <pic:spPr>
-                    <a:xfrm>
-                      <a:off x="0" y="0"/>
-                      <a:ext cx="5029200" cy="4215225"/>
-                    </a:xfrm>
-                    <a:prstGeom prst="rect">
-                      <a:avLst/>
-                    </a:prstGeom>
-                  </pic:spPr>
-                </pic:pic>
-              </a:graphicData>
-            </a:graphic>
-          </wp:inline>
-        </w:drawing>
-      </w:r>
-    </w:p>
-    <w:p>
-      <w:pPr>
-        <w:spacing w:before="20" w:after="160"/>
-        <w:jc w:val="center"/>
-      </w:pPr>
-      <w:r>
-        <w:rPr>
-          <w:i/>
-          <w:color w:val="666666"/>
-          <w:sz w:val="18"/>
-        </w:rPr>
-        <w:t>Hình 11: Swagger UI - Trang API Documentation cho các microservices</w:t>
       </w:r>
     </w:p>
     <w:p>
@@ -6298,7 +6043,7 @@
                     <pic:cNvPicPr/>
                   </pic:nvPicPr>
                   <pic:blipFill>
-                    <a:blip r:embed="rId20"/>
+                    <a:blip r:embed="rId15"/>
                     <a:stretch>
                       <a:fillRect/>
                     </a:stretch>
@@ -6359,7 +6104,7 @@
                     <pic:cNvPicPr/>
                   </pic:nvPicPr>
                   <pic:blipFill>
-                    <a:blip r:embed="rId21"/>
+                    <a:blip r:embed="rId16"/>
                     <a:stretch>
                       <a:fillRect/>
                     </a:stretch>
@@ -6396,153 +6141,9 @@
     </w:p>
     <w:p>
       <w:pPr>
-        <w:spacing w:before="120" w:after="60"/>
-        <w:jc w:val="center"/>
-      </w:pPr>
-      <w:r>
-        <w:rPr>
-          <w:noProof/>
-        </w:rPr>
-        <w:lastRenderedPageBreak/>
-        <w:drawing>
-          <wp:inline distT="0" distB="0" distL="0" distR="0" wp14:anchorId="214A98D2" wp14:editId="45D57167">
-            <wp:extent cx="5029200" cy="4215225"/>
-            <wp:effectExtent l="0" t="0" r="0" b="0"/>
-            <wp:docPr id="11" name="Picture 11"/>
-            <wp:cNvGraphicFramePr>
-              <a:graphicFrameLocks xmlns:a="http://schemas.openxmlformats.org/drawingml/2006/main" noChangeAspect="1"/>
-            </wp:cNvGraphicFramePr>
-            <a:graphic xmlns:a="http://schemas.openxmlformats.org/drawingml/2006/main">
-              <a:graphicData uri="http://schemas.openxmlformats.org/drawingml/2006/picture">
-                <pic:pic xmlns:pic="http://schemas.openxmlformats.org/drawingml/2006/picture">
-                  <pic:nvPicPr>
-                    <pic:cNvPr id="0" name="yas-swagger.png"/>
-                    <pic:cNvPicPr/>
-                  </pic:nvPicPr>
-                  <pic:blipFill>
-                    <a:blip r:embed="rId19"/>
-                    <a:stretch>
-                      <a:fillRect/>
-                    </a:stretch>
-                  </pic:blipFill>
-                  <pic:spPr>
-                    <a:xfrm>
-                      <a:off x="0" y="0"/>
-                      <a:ext cx="5029200" cy="4215225"/>
-                    </a:xfrm>
-                    <a:prstGeom prst="rect">
-                      <a:avLst/>
-                    </a:prstGeom>
-                  </pic:spPr>
-                </pic:pic>
-              </a:graphicData>
-            </a:graphic>
-          </wp:inline>
-        </w:drawing>
-      </w:r>
-    </w:p>
-    <w:p>
-      <w:pPr>
         <w:spacing w:before="20" w:after="160"/>
         <w:jc w:val="center"/>
       </w:pPr>
-      <w:r>
-        <w:rPr>
-          <w:i/>
-          <w:color w:val="666666"/>
-          <w:sz w:val="18"/>
-        </w:rPr>
-        <w:t>Hình 11: Swagger UI - Trang API Documentation cho các microservices</w:t>
-      </w:r>
-    </w:p>
-    <w:tbl>
-      <w:tblPr>
-        <w:tblW w:w="0" w:type="auto"/>
-        <w:jc w:val="center"/>
-        <w:tblLayout w:type="fixed"/>
-        <w:tblLook w:val="04A0" w:firstRow="1" w:lastRow="0" w:firstColumn="1" w:lastColumn="0" w:noHBand="0" w:noVBand="1"/>
-      </w:tblPr>
-      <w:tblGrid>
-        <w:gridCol w:w="9360"/>
-      </w:tblGrid>
-      <w:tr>
-        <w:trPr>
-          <w:jc w:val="center"/>
-        </w:trPr>
-        <w:tc>
-          <w:tcPr>
-            <w:tcW w:w="9360" w:type="dxa"/>
-            <w:tcBorders>
-              <w:left w:val="single" w:sz="24" w:space="0" w:color="1B365D"/>
-            </w:tcBorders>
-            <w:shd w:val="clear" w:color="auto" w:fill="F0F4F8"/>
-            <w:tcMar>
-              <w:top w:w="140" w:type="dxa"/>
-              <w:left w:w="200" w:type="dxa"/>
-              <w:bottom w:w="140" w:type="dxa"/>
-              <w:right w:w="200" w:type="dxa"/>
-            </w:tcMar>
-          </w:tcPr>
-          <w:p>
-            <w:pPr>
-              <w:spacing w:before="80" w:after="80"/>
-            </w:pPr>
-            <w:r>
-              <w:rPr>
-                <w:i/>
-                <w:sz w:val="21"/>
-              </w:rPr>
-              <w:t>Giao diện Grafana cung cấp đầy đủ các biểu đồ giám sát mạng lưới Istio Mesh, đo lường số lượng truy cập trên giây (RPS), tỷ lệ lỗi kết nối, độ trễ phản hồi (latency), lượng CPU/RAM tiêu hao của từng Pod và tích hợp bộ lọc logs thông minh từ Loki, hỗ trợ đắc lực cho công tác vận hành.</w:t>
-            </w:r>
-          </w:p>
-        </w:tc>
-      </w:tr>
-    </w:tbl>
-    <w:p>
-      <w:pPr>
-        <w:pStyle w:val="Heading1"/>
-        <w:spacing w:before="240" w:after="120"/>
-      </w:pPr>
-      <w:r>
-        <w:rPr>
-          <w:rFonts w:ascii="Arial" w:hAnsi="Arial"/>
-          <w:color w:val="1B365D"/>
-          <w:sz w:val="36"/>
-        </w:rPr>
-        <w:t>PHẦN VI: KẾT LUẬN &amp; ĐÁNH GIÁ CHUNG</w:t>
-      </w:r>
-    </w:p>
-    <w:p>
-      <w:r>
-        <w:t>Đồ án môn học đã hoàn thành xuất sắc 100% mục tiêu đề ra:</w:t>
-      </w:r>
-    </w:p>
-    <w:p>
-      <w:pPr>
-        <w:pStyle w:val="ListBullet"/>
-        <w:spacing w:after="60"/>
-      </w:pPr>
-      <w:r>
-        <w:t>Pipeline CD hoạt động ổn định, thông minh, tiết kiệm tài nguyên mạng và thời gian của nhà phát triển.</w:t>
-      </w:r>
-    </w:p>
-    <w:p>
-      <w:pPr>
-        <w:pStyle w:val="ListBullet"/>
-        <w:spacing w:after="60"/>
-      </w:pPr>
-      <w:r>
-        <w:t>Áp dụng thành công triết lý GitOps chuyên nghiệp bằng ArgoCD cho cả môi trường Dev và Staging.</w:t>
-      </w:r>
-    </w:p>
-    <w:p>
-      <w:pPr>
-        <w:pStyle w:val="ListBullet"/>
-        <w:spacing w:after="120"/>
-      </w:pPr>
-      <w:r>
-        <w:t>Hệ thống Service Mesh của Istio hoạt động bảo mật, có khả năng tự khắc phục sự cố và kháng lỗi tốt tầng ứng dụng.</w:t>
-      </w:r>
     </w:p>
     <w:sectPr>
       <w:pgSz w:w="11909" w:h="16834"/>

</xml_diff>